<commit_message>
Change safe location: study closet → hallway closet (English + French)
</commit_message>
<xml_diff>
--- a/props/margarets_french_letter.docx
+++ b/props/margarets_french_letter.docx
@@ -53,7 +53,7 @@
           <w:sz w:val="24"/>
           <w:szCs w:val="24"/>
         </w:rPr>
-        <w:t xml:space="preserve">Tu as toujours gardé tes secrets sous clé. Tout comme ce coffre-fort dans le placard de ton bureau. Je sais que tu as un cœur quelque part là-dedans. Même si tu n'as montré aucun cœur quand tu m'as envoyée loin de toi.</w:t>
+        <w:t xml:space="preserve">Tu as toujours gardé tes secrets sous clé. Tout comme ce coffre-fort dans le placard du couloir. Je sais que tu as un cœur quelque part là-dedans. Même si tu n'as montré aucun cœur quand tu m'as envoyée loin de toi.</w:t>
       </w:r>
     </w:p>
     <w:p>
@@ -130,7 +130,7 @@
     </w:p>
     <w:p>
       <w:pPr>
-        <w:spacing w:after="60" w:before="0"/>
+        <w:spacing w:after="120" w:before="0"/>
         <w:jc w:val="left"/>
       </w:pPr>
       <w:r>
@@ -148,7 +148,7 @@
     </w:p>
     <w:p>
       <w:pPr>
-        <w:spacing w:before="200"/>
+        <w:spacing w:before="400"/>
         <w:jc w:val="center"/>
       </w:pPr>
       <w:r>

</xml_diff>